<commit_message>
feat: complete onboarding and sync workspace docs
</commit_message>
<xml_diff>
--- a/AirNote_01_产品背景文档_v0.3.docx
+++ b/AirNote_01_产品背景文档_v0.3.docx
@@ -3420,6 +3420,92 @@
         <w:t>新手引导、夜间模式、框选和套索失败时不得阻塞鼠标绘制、卡片、连接、撤销和本地保存。</w:t>
       </w:r>
     </w:p>
+    <w:p>
+      <w:pPr>
+        <w:pStyle w:val="Heading1"/>
+      </w:pPr>
+      <w:r>
+        <w:t>11. 2026年7月28日工作区交互修订</w:t>
+      </w:r>
+    </w:p>
+    <w:p>
+      <w:pPr/>
+      <w:r>
+        <w:t>本节记录产品负责人于2026年7月28日对单工作区画布、卡片拖动和新手引导快捷键的确认。若与前文“拖动卡片标题区”或“至少保留24px可见”等描述冲突，以本节为准。</w:t>
+      </w:r>
+    </w:p>
+    <w:p>
+      <w:pPr>
+        <w:pStyle w:val="Heading2"/>
+      </w:pPr>
+      <w:r>
+        <w:t>11.1 单工作区无边界画布</w:t>
+      </w:r>
+    </w:p>
+    <w:p>
+      <w:pPr>
+        <w:pStyle w:val="ListBullet"/>
+      </w:pPr>
+      <w:r>
+        <w:t>画布继续保持单工作区，但取消视口平移和卡片位置的可见边界限制；用户可以在25%—300%范围内缩放，并通过平移浏览任意世界坐标位置。</w:t>
+      </w:r>
+    </w:p>
+    <w:p>
+      <w:pPr>
+        <w:pStyle w:val="ListBullet"/>
+      </w:pPr>
+      <w:r>
+        <w:t>卡片、Stroke、连接线、选区和分组提示共享同一世界坐标系；平移或缩放只改变查看方式，不改写原始Stroke.points。</w:t>
+      </w:r>
+    </w:p>
+    <w:p>
+      <w:pPr>
+        <w:pStyle w:val="ListBullet"/>
+      </w:pPr>
+      <w:r>
+        <w:t>“无边界”只表示单工作区内不显示或钳制可见边界，不新增多画布、文件管理、完整白板SDK或云端空间。</w:t>
+      </w:r>
+    </w:p>
+    <w:p>
+      <w:pPr>
+        <w:pStyle w:val="Heading2"/>
+      </w:pPr>
+      <w:r>
+        <w:t>11.2 卡片与工具交互</w:t>
+      </w:r>
+    </w:p>
+    <w:p>
+      <w:pPr>
+        <w:pStyle w:val="ListBullet"/>
+      </w:pPr>
+      <w:r>
+        <w:t>选择工具下，卡片除输入框、文本域、按钮、链接和可编辑内容外，整张卡片表面均可用鼠标拖动；交互控件继续执行原本的编辑或操作行为。</w:t>
+      </w:r>
+    </w:p>
+    <w:p>
+      <w:pPr>
+        <w:pStyle w:val="ListBullet"/>
+      </w:pPr>
+      <w:r>
+        <w:t>卡片允许移动到当前视口之外，不再强制保留24px可见；用户通过画布平移和缩放找回内容，非有限坐标仍被拒绝。</w:t>
+      </w:r>
+    </w:p>
+    <w:p>
+      <w:pPr>
+        <w:pStyle w:val="ListBullet"/>
+      </w:pPr>
+      <w:r>
+        <w:t>左侧工具栏图标保持视觉居中；V/P/E/H/R/L/T分别用于选择、画笔、整笔橡皮擦、平移、矩形框选、自由套索和新建文字卡片。</w:t>
+      </w:r>
+    </w:p>
+    <w:p>
+      <w:pPr>
+        <w:pStyle w:val="ListBullet"/>
+      </w:pPr>
+      <w:r>
+        <w:t>单键工具快捷键仅在非文字编辑、非弹窗和非校准状态下生效；不改变鼠标降级、核心手势、隐私或数据边界。</w:t>
+      </w:r>
+    </w:p>
     <w:sectPr>
       <w:headerReference w:type="default" r:id="rId9"/>
       <w:footerReference w:type="default" r:id="rId10"/>

</xml_diff>